<commit_message>
added other files in AboutEditor
</commit_message>
<xml_diff>
--- a/posts/BrynjolfssonLiRaymond/BrynjolfssonLiRaymond2025.docx
+++ b/posts/BrynjolfssonLiRaymond/BrynjolfssonLiRaymond2025.docx
@@ -42,7 +42,7 @@
         <w:pStyle w:val="Date"/>
       </w:pPr>
       <w:r>
-        <w:t xml:space="preserve">August 22, 2025, 12:08 +0900</w:t>
+        <w:t xml:space="preserve">August 22, 2025, 16:08 +0900</w:t>
       </w:r>
     </w:p>
     <w:p>
@@ -3715,7 +3715,7 @@
         </w:numPr>
       </w:pPr>
       <w:r>
-        <w:t xml:space="preserve">Early empirical evidence on theeffects of a generative AI tool in a real-world workplace</w:t>
+        <w:t xml:space="preserve">Early empirical evidence on the effects of a generative AI tool in a real-world workplace</w:t>
       </w:r>
     </w:p>
     <w:p>
@@ -4137,6 +4137,54 @@
           <w:rFonts w:hint="eastAsia"/>
         </w:rPr>
         <w:t xml:space="preserve">tasksでの影響とは違う</w:t>
+      </w:r>
+    </w:p>
+    <w:p>
+      <w:pPr>
+        <w:numPr>
+          <w:ilvl w:val="2"/>
+          <w:numId w:val="1045"/>
+        </w:numPr>
+      </w:pPr>
+      <w:r>
+        <w:rPr>
+          <w:rFonts w:hint="eastAsia"/>
+        </w:rPr>
+        <w:t xml:space="preserve">非テキスト・ベースのタスク=uncodifiable</w:t>
+      </w:r>
+    </w:p>
+    <w:p>
+      <w:pPr>
+        <w:pStyle w:val="BlockText"/>
+        <w:numPr>
+          <w:ilvl w:val="2"/>
+          <w:numId w:val="1000"/>
+        </w:numPr>
+      </w:pPr>
+      <w:r>
+        <w:t xml:space="preserve">manage employees, raise capital, pilot new initiatives, run advertising strategies, price their services, react to competitors, and decide which of these and myriad other tasks to focus their efforts on (Chandler, 1977, quoted from Otis et al. 2023)</w:t>
+      </w:r>
+    </w:p>
+    <w:p>
+      <w:pPr>
+        <w:numPr>
+          <w:ilvl w:val="2"/>
+          <w:numId w:val="1045"/>
+        </w:numPr>
+      </w:pPr>
+      <w:hyperlink r:id="rId32">
+        <w:r>
+          <w:rPr>
+            <w:rStyle w:val="Hyperlink"/>
+          </w:rPr>
+          <w:t xml:space="preserve">Otis et al. (2023)</w:t>
+        </w:r>
+      </w:hyperlink>
+      <w:r>
+        <w:rPr>
+          <w:rFonts w:hint="eastAsia"/>
+        </w:rPr>
+        <w:t xml:space="preserve">では優秀な経営者のみAIの利潤効果が正、それ以外は負</w:t>
       </w:r>
     </w:p>
     <w:bookmarkStart w:id="82" w:name="refs"/>
@@ -5477,6 +5525,9 @@
     <w:abstractNumId w:val="991"/>
   </w:num>
   <w:num w:numId="1044">
+    <w:abstractNumId w:val="991"/>
+  </w:num>
+  <w:num w:numId="1045">
     <w:abstractNumId w:val="991"/>
   </w:num>
 </w:numbering>

</xml_diff>